<commit_message>
FSL convenzioni firmate e tutorato con pagamenti e import dei vincitori
FSL (A1-A4): la scuola carica la convenzione PAdES con l'Allegato A, presa in carico e protocollo in ingresso, firma del Direttore, protocollo definitivo; documenti per la scuola e notifiche; tolto l'anno dai modelli.
Tutorato (D1-D2): uffici di Ateneo, decreti e UNILAV, dichiarazione individuale online con IBAN cifrato (CIFRATURA_CHIAVE), compenso 25 euro/h, validazione e ufficio pagamenti, area personale del tutor, import dei vincitori dal Word del decreto con abbinamento agli insegnamenti dell'anagrafe.
Schema v54. Piano, mappa dei file da caricare e prove inclusi.
</commit_message>
<xml_diff>
--- a/modelli_documenti/allegato_a_precompilabile.docx
+++ b/modelli_documenti/allegato_a_precompilabile.docx
@@ -23,47 +23,7 @@
           <w:szCs w:val="22"/>
           <w:lang w:eastAsia="en-US"/>
         </w:rPr>
-        <w:t xml:space="preserve">CONVENZIONE Formazione Scuola-Lavoro </w:t>
-      </w:r>
-      <w:r>
-        <w:rPr>
-          <w:rFonts w:ascii="Calibri" w:eastAsia="Calibri" w:hAnsi="Calibri" w:cs="Calibri"/>
-          <w:b/>
-          <w:sz w:val="22"/>
-          <w:szCs w:val="22"/>
-          <w:lang w:eastAsia="en-US"/>
-        </w:rPr>
-        <w:t>A.A. 202</w:t>
-      </w:r>
-      <w:r>
-        <w:rPr>
-          <w:rFonts w:ascii="Calibri" w:eastAsia="Calibri" w:hAnsi="Calibri" w:cs="Calibri"/>
-          <w:b/>
-          <w:sz w:val="22"/>
-          <w:szCs w:val="22"/>
-          <w:lang w:eastAsia="en-US"/>
-        </w:rPr>
-        <w:t>6</w:t>
-      </w:r>
-      <w:r>
-        <w:rPr>
-          <w:rFonts w:ascii="Calibri" w:eastAsia="Calibri" w:hAnsi="Calibri" w:cs="Calibri"/>
-          <w:b/>
-          <w:sz w:val="22"/>
-          <w:szCs w:val="22"/>
-          <w:lang w:eastAsia="en-US"/>
-        </w:rPr>
-        <w:t>/202</w:t>
-      </w:r>
-      <w:r>
-        <w:rPr>
-          <w:rFonts w:ascii="Calibri" w:eastAsia="Calibri" w:hAnsi="Calibri" w:cs="Calibri"/>
-          <w:b/>
-          <w:sz w:val="22"/>
-          <w:szCs w:val="22"/>
-          <w:lang w:eastAsia="en-US"/>
-        </w:rPr>
-        <w:t>7</w:t>
+        <w:t xml:space="preserve">CONVENZIONE Formazione Scuola-Lavoro</w:t>
       </w:r>
     </w:p>
     <w:bookmarkEnd w:id="0"/>

</xml_diff>